<commit_message>
Rehber: Fuzuli sahne notu yeni figurlerle guncellendi (+docx yenilendi)
Co-Authored-By: Claude Fable 5 <noreply@anthropic.com>
</commit_message>
<xml_diff>
--- a/senaryo/anlatim-rehberi-25agustos2026.docx
+++ b/senaryo/anlatim-rehberi-25agustos2026.docx
@@ -1265,19 +1265,61 @@
         <w:t xml:space="preserve"> </w:t>
       </w:r>
       <w:r>
-        <w:t xml:space="preserve">Dört adımlık hesabı sahnede okuma; haritayı göster, aritmetiği sayfaya</w:t>
-      </w:r>
-      <w:r>
-        <w:t xml:space="preserve"> </w:t>
-      </w:r>
-      <w:r>
-        <w:t xml:space="preserve">bırak. Soru gelirse "Hesabın tamamı" bölmesini aç — tablo ve formüller</w:t>
-      </w:r>
-      <w:r>
-        <w:t xml:space="preserve"> </w:t>
-      </w:r>
-      <w:r>
-        <w:t xml:space="preserve">orada katlı duruyor.</w:t>
+        <w:t xml:space="preserve">Eksenlerin adı artık üstünde (acı ve ümit çağrışımı); "oyuncakta ad</w:t>
+      </w:r>
+      <w:r>
+        <w:t xml:space="preserve"> </w:t>
+      </w:r>
+      <w:r>
+        <w:t xml:space="preserve">verdik, gerçekte adsız ve binlerce" cümlesi hazır.</w:t>
+      </w:r>
+      <w:r>
+        <w:t xml:space="preserve"> </w:t>
+      </w:r>
+      <w:r>
+        <w:t xml:space="preserve">Dört adımlık hesabı sahnede okuma; hesap şeridi ve Pisagor üçgenleri</w:t>
+      </w:r>
+      <w:r>
+        <w:t xml:space="preserve"> </w:t>
+      </w:r>
+      <w:r>
+        <w:t xml:space="preserve">sayfada, soru gelirse "Hesabın tamamı" bölmesi de katlı duruyor.</w:t>
+      </w:r>
+      <w:r>
+        <w:t xml:space="preserve"> </w:t>
+      </w:r>
+      <w:r>
+        <w:t xml:space="preserve">Vakit varsa 3B figürde tek cümle (15 sn):</w:t>
+      </w:r>
+      <w:r>
+        <w:t xml:space="preserve"> </w:t>
+      </w:r>
+      <w:r>
+        <w:rPr>
+          <w:i/>
+          <w:iCs/>
+        </w:rPr>
+        <w:t xml:space="preserve">"Bir eksen ekledik — uzlet;</w:t>
+      </w:r>
+      <w:r>
+        <w:rPr>
+          <w:i/>
+          <w:iCs/>
+        </w:rPr>
+        <w:t xml:space="preserve"> </w:t>
+      </w:r>
+      <w:r>
+        <w:rPr>
+          <w:i/>
+          <w:iCs/>
+        </w:rPr>
+        <w:t xml:space="preserve">hesap değişmedi, sonuç yine 0,93. Binlerce eksende de hesap bu."</w:t>
+      </w:r>
+      <w:r>
+        <w:t xml:space="preserve"> </w:t>
+      </w:r>
+      <w:r>
+        <w:t xml:space="preserve">Bu cümle, 'binlerce boyut' lafını masala olmaktan çıkarır.</w:t>
       </w:r>
     </w:p>
     <w:p>

</xml_diff>